<commit_message>
Update site with latest changes for carousel, video, and navigation offset
</commit_message>
<xml_diff>
--- a/Blog and Resources/Junior Mining Exploration and Prospecting in Northwestern Ontario A Distributive Politics Analysis.docx
+++ b/Blog and Resources/Junior Mining Exploration and Prospecting in Northwestern Ontario A Distributive Politics Analysis.docx
@@ -899,7 +899,21 @@
         <w:rPr>
           <w:rFonts w:ascii="Poppins" w:hAnsi="Poppins" w:cs="Poppins"/>
         </w:rPr>
-        <w:t xml:space="preserve">Environmental opposition has intensified alongside Indigenous resistance, with groups like Environmental Defence Canada documenting the ecological risks posed by mining development in the James Bay Lowlands—home to the world's third-largest wetland and a critical carbon sink </w:t>
+        <w:t xml:space="preserve">Environmental opposition has intensified alongside Indigenous resistance, with groups like Environmental </w:t>
+      </w:r>
+      <w:proofErr w:type="spellStart"/>
+      <w:r>
+        <w:rPr>
+          <w:rFonts w:ascii="Poppins" w:hAnsi="Poppins" w:cs="Poppins"/>
+        </w:rPr>
+        <w:t>Defence</w:t>
+      </w:r>
+      <w:proofErr w:type="spellEnd"/>
+      <w:r>
+        <w:rPr>
+          <w:rFonts w:ascii="Poppins" w:hAnsi="Poppins" w:cs="Poppins"/>
+        </w:rPr>
+        <w:t xml:space="preserve"> Canada documenting the ecological risks posed by mining development in the James Bay Lowlands—home to the world's third-largest wetland and a critical carbon sink </w:t>
       </w:r>
       <w:hyperlink w:anchor="X1d5781111d84f7b3fe45a0852e59758cd7a87e5">
         <w:r>
@@ -1659,7 +1673,21 @@
         <w:rPr>
           <w:rFonts w:ascii="Poppins" w:hAnsi="Poppins" w:cs="Poppins"/>
         </w:rPr>
-        <w:t xml:space="preserve">Indigenous communities and environmental organizations have developed alternative information sources challenging industry narratives. Environmental Defence Canada's research documenting the 66% surge in Ring of Fire mining claims provides critical data on the pace of exploration expansion </w:t>
+        <w:t xml:space="preserve">Indigenous communities and environmental organizations have developed alternative information sources challenging industry narratives. Environmental </w:t>
+      </w:r>
+      <w:proofErr w:type="spellStart"/>
+      <w:r>
+        <w:rPr>
+          <w:rFonts w:ascii="Poppins" w:hAnsi="Poppins" w:cs="Poppins"/>
+        </w:rPr>
+        <w:t>Defence</w:t>
+      </w:r>
+      <w:proofErr w:type="spellEnd"/>
+      <w:r>
+        <w:rPr>
+          <w:rFonts w:ascii="Poppins" w:hAnsi="Poppins" w:cs="Poppins"/>
+        </w:rPr>
+        <w:t xml:space="preserve"> Canada's research documenting the 66% surge in Ring of Fire mining claims provides critical data on the pace of exploration expansion </w:t>
       </w:r>
       <w:hyperlink w:anchor="Xc33ea4e26e5e1af1408321416956113a4658763">
         <w:r>
@@ -2211,7 +2239,21 @@
         <w:rPr>
           <w:rFonts w:ascii="Prata" w:hAnsi="Prata"/>
         </w:rPr>
-        <w:t xml:space="preserve">[3] Environmental Defence Canada. (2025). </w:t>
+        <w:t xml:space="preserve">[3] Environmental </w:t>
+      </w:r>
+      <w:proofErr w:type="spellStart"/>
+      <w:r>
+        <w:rPr>
+          <w:rFonts w:ascii="Prata" w:hAnsi="Prata"/>
+        </w:rPr>
+        <w:t>Defence</w:t>
+      </w:r>
+      <w:proofErr w:type="spellEnd"/>
+      <w:r>
+        <w:rPr>
+          <w:rFonts w:ascii="Prata" w:hAnsi="Prata"/>
+        </w:rPr>
+        <w:t xml:space="preserve"> Canada. (2025). </w:t>
       </w:r>
       <w:r>
         <w:rPr>
@@ -2587,8 +2629,18 @@
           <w:i/>
           <w:iCs/>
         </w:rPr>
-        <w:t>Neskantaga First Nation confronts junior miner</w:t>
-      </w:r>
+        <w:t xml:space="preserve">Neskantaga First Nation confronts junior </w:t>
+      </w:r>
+      <w:proofErr w:type="gramStart"/>
+      <w:r>
+        <w:rPr>
+          <w:rFonts w:ascii="Prata" w:hAnsi="Prata"/>
+          <w:i/>
+          <w:iCs/>
+        </w:rPr>
+        <w:t>miner</w:t>
+      </w:r>
+      <w:proofErr w:type="gramEnd"/>
       <w:r>
         <w:rPr>
           <w:rFonts w:ascii="Prata" w:hAnsi="Prata"/>
@@ -2870,7 +2922,25 @@
           <w:i/>
           <w:iCs/>
         </w:rPr>
-        <w:t>Ontario First Nation prepared to block highway to stop mining near drinking water source</w:t>
+        <w:t xml:space="preserve">Ontario First Nation prepared to block </w:t>
+      </w:r>
+      <w:proofErr w:type="gramStart"/>
+      <w:r>
+        <w:rPr>
+          <w:rFonts w:ascii="Prata" w:hAnsi="Prata"/>
+          <w:i/>
+          <w:iCs/>
+        </w:rPr>
+        <w:t>highway</w:t>
+      </w:r>
+      <w:proofErr w:type="gramEnd"/>
+      <w:r>
+        <w:rPr>
+          <w:rFonts w:ascii="Prata" w:hAnsi="Prata"/>
+          <w:i/>
+          <w:iCs/>
+        </w:rPr>
+        <w:t xml:space="preserve"> to stop mining near drinking water source</w:t>
       </w:r>
       <w:r>
         <w:rPr>
@@ -3118,7 +3188,25 @@
           <w:i/>
           <w:iCs/>
         </w:rPr>
-        <w:t>Life on the frontlines of Ontario's critical mineral boom</w:t>
+        <w:t xml:space="preserve">Life </w:t>
+      </w:r>
+      <w:proofErr w:type="gramStart"/>
+      <w:r>
+        <w:rPr>
+          <w:rFonts w:ascii="Prata" w:hAnsi="Prata"/>
+          <w:i/>
+          <w:iCs/>
+        </w:rPr>
+        <w:t>on</w:t>
+      </w:r>
+      <w:proofErr w:type="gramEnd"/>
+      <w:r>
+        <w:rPr>
+          <w:rFonts w:ascii="Prata" w:hAnsi="Prata"/>
+          <w:i/>
+          <w:iCs/>
+        </w:rPr>
+        <w:t xml:space="preserve"> the frontlines of Ontario's critical mineral boom</w:t>
       </w:r>
       <w:r>
         <w:rPr>
@@ -3191,7 +3279,21 @@
           <w:rFonts w:ascii="Prata" w:hAnsi="Prata"/>
         </w:rPr>
         <w:lastRenderedPageBreak/>
-        <w:t xml:space="preserve">[27] Environmental Defence Canada. (2025). </w:t>
+        <w:t xml:space="preserve">[27] Environmental </w:t>
+      </w:r>
+      <w:proofErr w:type="spellStart"/>
+      <w:r>
+        <w:rPr>
+          <w:rFonts w:ascii="Prata" w:hAnsi="Prata"/>
+        </w:rPr>
+        <w:t>Defence</w:t>
+      </w:r>
+      <w:proofErr w:type="spellEnd"/>
+      <w:r>
+        <w:rPr>
+          <w:rFonts w:ascii="Prata" w:hAnsi="Prata"/>
+        </w:rPr>
+        <w:t xml:space="preserve"> Canada. (2025). </w:t>
       </w:r>
       <w:r>
         <w:rPr>

</xml_diff>